<commit_message>
edelleen kehitetty testia.py laskun tulostamista varten
</commit_message>
<xml_diff>
--- a/docs/saved_invoices/valmis_lasku.docx
+++ b/docs/saved_invoices/valmis_lasku.docx
@@ -133,7 +133,7 @@
               <w:rPr>
                 <w:lang w:val="fi-FI"/>
               </w:rPr>
-              <w:t xml:space="preserve">2600008</w:t>
+              <w:t xml:space="preserve">2600009</w:t>
             </w:r>
           </w:p>
         </w:tc>
@@ -185,7 +185,7 @@
                 <w:szCs w:val="22"/>
                 <w:lang w:val="fi-FI"/>
               </w:rPr>
-              <w:t xml:space="preserve">15.04.2026</w:t>
+              <w:t xml:space="preserve">16.04.2026</w:t>
             </w:r>
           </w:p>
           <w:p>
@@ -222,7 +222,7 @@
                 <w:szCs w:val="22"/>
                 <w:lang w:val="fi-FI"/>
               </w:rPr>
-              <w:t xml:space="preserve">23.04.2026</w:t>
+              <w:t xml:space="preserve">24.04.2026</w:t>
             </w:r>
           </w:p>
           <w:p>
@@ -259,7 +259,7 @@
                 <w:szCs w:val="22"/>
                 <w:lang w:val="fi-FI"/>
               </w:rPr>
-              <w:t xml:space="preserve">26000084</w:t>
+              <w:t xml:space="preserve">26000097</w:t>
             </w:r>
           </w:p>
           <w:p>
@@ -366,7 +366,7 @@
                 <w:szCs w:val="22"/>
                 <w:lang w:val="fi-FI"/>
               </w:rPr>
-              <w:t xml:space="preserve">Kaukon Baari Ky</w:t>
+              <w:t xml:space="preserve">Konepaja Aurora Oy</w:t>
             </w:r>
           </w:p>
           <w:p>
@@ -396,7 +396,7 @@
                 <w:szCs w:val="22"/>
                 <w:lang w:val="fi-FI"/>
               </w:rPr>
-              <w:t xml:space="preserve">Hämeentie 12</w:t>
+              <w:t xml:space="preserve">Teollisuustie 5</w:t>
             </w:r>
             <w:r>
               <w:rPr>
@@ -419,7 +419,7 @@
                 <w:szCs w:val="22"/>
                 <w:lang w:val="fi-FI"/>
               </w:rPr>
-              <w:t xml:space="preserve">00530 </w:t>
+              <w:t xml:space="preserve">33800 </w:t>
             </w:r>
             <w:proofErr w:type="gramStart"/>
             <w:r>
@@ -431,7 +431,7 @@
                 <w:szCs w:val="22"/>
                 <w:lang w:val="fi-FI"/>
               </w:rPr>
-              <w:t xml:space="preserve">Helsinki</w:t>
+              <w:t xml:space="preserve">Tampere</w:t>
             </w:r>
           </w:p>
           <w:p>
@@ -485,7 +485,7 @@
                 <w:szCs w:val="22"/>
                 <w:lang w:val="fi-FI"/>
               </w:rPr>
-              <w:t xml:space="preserve">1122567-7</w:t>
+              <w:t xml:space="preserve">1234567-8</w:t>
             </w:r>
             <w:r>
               <w:rPr>
@@ -520,7 +520,7 @@
                 <w:szCs w:val="22"/>
                 <w:lang w:val="fi-FI"/>
               </w:rPr>
-              <w:t xml:space="preserve">FI11225677</w:t>
+              <w:t xml:space="preserve">FI12345678</w:t>
             </w:r>
           </w:p>
           <w:p>
@@ -568,7 +568,7 @@
                 <w:szCs w:val="22"/>
                 <w:lang w:val="fi-FI"/>
               </w:rPr>
-              <w:t xml:space="preserve">Viitteenne: 3421</w:t>
+              <w:t xml:space="preserve">Viitteenne: JARVI-2025-014</w:t>
             </w:r>
             <w:r>
               <w:rPr>
@@ -813,7 +813,7 @@
                 <w:szCs w:val="22"/>
                 <w:lang w:val="fi-FI"/>
               </w:rPr>
-              <w:t xml:space="preserve">Äänentoiston asennus</w:t>
+              <w:t xml:space="preserve">2025-03-14, Huoltotyö, Rakennustyömaan väliaikaisen sähkökeskuksen huolto, Joensuun työmaa</w:t>
             </w:r>
             <w:r>
               <w:rPr>
@@ -860,7 +860,7 @@
                 <w:szCs w:val="22"/>
                 <w:lang w:val="fi-FI"/>
               </w:rPr>
-              <w:t xml:space="preserve">1</w:t>
+              <w:t xml:space="preserve">2</w:t>
             </w:r>
             <w:r>
               <w:rPr>
@@ -907,7 +907,7 @@
                 <w:szCs w:val="22"/>
                 <w:lang w:val="fi-FI"/>
               </w:rPr>
-              <w:t xml:space="preserve">239.04</w:t>
+              <w:t xml:space="preserve">525.90</w:t>
             </w:r>
             <w:r>
               <w:rPr>
@@ -953,7 +953,7 @@
                 <w:szCs w:val="22"/>
                 <w:lang w:val="fi-FI"/>
               </w:rPr>
-              <w:t xml:space="preserve">239.04</w:t>
+              <w:t xml:space="preserve">1051.79</w:t>
             </w:r>
             <w:r>
               <w:rPr>
@@ -999,7 +999,7 @@
                 <w:szCs w:val="22"/>
                 <w:lang w:val="fi-FI"/>
               </w:rPr>
-              <w:t xml:space="preserve">60.96</w:t>
+              <w:t xml:space="preserve">268.21</w:t>
             </w:r>
             <w:r>
               <w:rPr>
@@ -1161,7 +1161,7 @@
                 <w:szCs w:val="22"/>
                 <w:lang w:val="fi-FI"/>
               </w:rPr>
-              <w:t xml:space="preserve">239.04</w:t>
+              <w:t xml:space="preserve">1051.79</w:t>
             </w:r>
             <w:r>
               <w:rPr>
@@ -1257,7 +1257,7 @@
                 <w:szCs w:val="22"/>
                 <w:lang w:val="fi-FI"/>
               </w:rPr>
-              <w:t xml:space="preserve">60.96</w:t>
+              <w:t xml:space="preserve">268.21</w:t>
             </w:r>
             <w:r>
               <w:rPr>
@@ -1356,7 +1356,7 @@
                 <w:szCs w:val="22"/>
                 <w:lang w:val="fi-FI"/>
               </w:rPr>
-              <w:t xml:space="preserve">300.00 </w:t>
+              <w:t xml:space="preserve">1320.00 </w:t>
             </w:r>
             <w:r>
               <w:rPr>

</xml_diff>

<commit_message>
muutettu make_invoice.py:ta ja testia.py:ta
</commit_message>
<xml_diff>
--- a/docs/saved_invoices/valmis_lasku.docx
+++ b/docs/saved_invoices/valmis_lasku.docx
@@ -133,7 +133,7 @@
               <w:rPr>
                 <w:lang w:val="fi-FI"/>
               </w:rPr>
-              <w:t xml:space="preserve">2600009</w:t>
+              <w:t xml:space="preserve">2600016</w:t>
             </w:r>
           </w:p>
         </w:tc>
@@ -185,7 +185,7 @@
                 <w:szCs w:val="22"/>
                 <w:lang w:val="fi-FI"/>
               </w:rPr>
-              <w:t xml:space="preserve">16.04.2026</w:t>
+              <w:t xml:space="preserve">20.04.2026</w:t>
             </w:r>
           </w:p>
           <w:p>
@@ -222,7 +222,7 @@
                 <w:szCs w:val="22"/>
                 <w:lang w:val="fi-FI"/>
               </w:rPr>
-              <w:t xml:space="preserve">24.04.2026</w:t>
+              <w:t xml:space="preserve">28.04.2026</w:t>
             </w:r>
           </w:p>
           <w:p>
@@ -259,7 +259,7 @@
                 <w:szCs w:val="22"/>
                 <w:lang w:val="fi-FI"/>
               </w:rPr>
-              <w:t xml:space="preserve">26000097</w:t>
+              <w:t xml:space="preserve">26000165</w:t>
             </w:r>
           </w:p>
           <w:p>

</xml_diff>